<commit_message>
Date PBO harmonisation and current approval signatures 2 October 2026
</commit_message>
<xml_diff>
--- a/ASCO Strategic Plan 2027-2029.docx
+++ b/ASCO Strategic Plan 2027-2029.docx
@@ -54,6 +54,11 @@
           <w:sz w:val="21"/>
         </w:rPr>
         <w:t>CIPC Registration No.: 2026/521895/08 | SARS Income Tax Reference: 9322812265 | SARS PBO Reference: 930092287</w:t>
+      </w:r>
+    </w:p>
+    <w:p>
+      <w:r>
+        <w:t>Updated: 2 October 2026 — PBO status and related current information harmonised.</w:t>
       </w:r>
     </w:p>
     <w:p>
@@ -496,7 +501,7 @@
                 <w:b/>
                 <w:bCs/>
               </w:rPr>
-              <w:t>6 September 2026</w:t>
+              <w:t>2 October 2026</w:t>
             </w:r>
             <w:r>
               <w:br/>
@@ -619,7 +624,7 @@
                 <w:b/>
                 <w:bCs/>
               </w:rPr>
-              <w:t>6 September 2026</w:t>
+              <w:t>2 October 2026</w:t>
             </w:r>
             <w:r>
               <w:br/>
@@ -751,7 +756,7 @@
                 <w:b/>
                 <w:bCs/>
               </w:rPr>
-              <w:t>6 September 2026</w:t>
+              <w:t>2 October 2026</w:t>
             </w:r>
             <w:r>
               <w:br/>
@@ -877,7 +882,7 @@
                 <w:b/>
                 <w:bCs/>
               </w:rPr>
-              <w:t>6 September 2026</w:t>
+              <w:t>2 October 2026</w:t>
             </w:r>
             <w:r>
               <w:br/>

</xml_diff>